<commit_message>
Fill RQ2 results into the paper draft
Table 3 reports four normalizations (window 60, clip/warmup off, 5 seeds)
with all-window RMSE plus cut-point RMSE and summed NASA Score. Section 5.2
leads with oc_minmax vs global_minmax and reports that oc_z vs oc_minmax
depends on the evaluation view. Score (Eq. 7) is now the sum over one
cut point per holdout engine. Protocol text and Table 2 state that RQ2
uses window 60 and RQ3 window 40; Fig. 1 no longer hard-codes T = 40.

Co-Authored-By: Claude Opus 5.5 <noreply@anthropic.com>
</commit_message>
<xml_diff>
--- a/paper/CIIE2026_fullpaper_v2.docx
+++ b/paper/CIIE2026_fullpaper_v2.docx
@@ -97,22 +97,7 @@
           <w:sz w:val="20"/>
           <w:szCs w:val="20"/>
         </w:rPr>
-        <w:t xml:space="preserve">航空發動機在多種操作工況下運轉時，感測器量測值同時反映設備退化與操作條件，使資料驅動的剩餘壽命（remaining useful life, RUL）預測面臨輸入分布異質的問題。本研究以NASA C-MAPSS資料集與雙面向自注意力Transformer（DAST）為基礎，在不修改模型架構的前提下，探討工況感知正規化的影響。研究流程以訓練引擎的操作設定建立K-means工況分群，並於各工況內進行逐感測器z-score正規化；所有統計量僅由訓練引擎估計，並以引擎層級的驗證集選擇模型。分析顯示，在FD002與FD004中，長度40的視窗內約99.9%的感測器變異可由工況切換解釋，且全域正規化無法改變此比例；經工況感知正規化後，該比例降至0.21至0.22，感測器與RUL的平均相關係數由約0.11提高至0.40以上。</w:t>
-      </w:r>
-      <w:r>
-        <w:rPr>
-          <w:sz w:val="20"/>
-          <w:szCs w:val="20"/>
-          <w:highlight w:val="yellow"/>
-        </w:rPr>
-        <w:t xml:space="preserve">【RQ2：正規化方式比較結果待補實驗後填入。】</w:t>
-      </w:r>
-      <w:r>
-        <w:rPr>
-          <w:sz w:val="20"/>
-          <w:szCs w:val="20"/>
-        </w:rPr>
-        <w:t xml:space="preserve">在工況感知正規化之下，12組梯度裁切與學習率暖身設定之間的保留集RMSE差距約為隨機種子間標準差的1至2倍，未呈現一致的額外效益。</w:t>
+        <w:t xml:space="preserve">航空發動機在多種操作工況下運轉時，感測器量測值同時反映設備退化與操作條件，使資料驅動的剩餘壽命（remaining useful life, RUL）預測面臨輸入分布異質的問題。本研究以NASA C-MAPSS資料集與雙面向自注意力Transformer（DAST）為基礎，在不修改模型架構的前提下，探討工況感知正規化的影響。研究流程以訓練引擎的操作設定建立K-means工況分群，並於各工況內進行逐感測器正規化（z-score或min-max）；所有統計量僅由訓練引擎估計，並以引擎層級的驗證集選擇模型。分析顯示，在FD002與FD004中，長度40的視窗內約99.9%的感測器變異可由工況切換解釋，且全域正規化無法改變此比例；經工況感知正規化後，該比例降至0.21至0.22，感測器與RUL的平均相關係數由約0.11提高至0.40以上。在保留引擎上以每台引擎一個隨機截斷點評估時，工況感知min-max相較DAST原文採用的全域min-max，使FD002與FD004的RMSE分別降低4.2與6.8，以隨機種子配對之差值的95%信賴區間皆不含零。在工況感知正規化之下，12組梯度裁切與學習率暖身設定之間的保留集RMSE差距約為隨機種子間標準差的1至2倍，未呈現一致的額外效益。</w:t>
       </w:r>
     </w:p>
     <w:p>
@@ -206,7 +191,7 @@
           <w:sz w:val="20"/>
           <w:szCs w:val="20"/>
         </w:rPr>
-        <w:t xml:space="preserve">因此，本研究固定DAST架構，僅改變輸入前處理，探討三個研究問題。RQ1：工況可解釋多少感測器變異？全域正規化能否消除此變異？RQ2：工況感知z-score正規化能否改善多工況子資料集的RUL預測？RQ3：在工況感知正規化之下，學習率暖身（warmup）與梯度裁切（gradient clipping）是否帶來額外效益？本文的貢獻包括：(1)以視窗層級的工況解釋變異量與感測器–RUL相關係數量化工況對模型輸入的影響，並說明全域正規化在數學上無法移除此影響；(2)建立工況分群與正規化統計量僅由訓練引擎估計、並以引擎層級驗證集選模的前處理流程；(3)在固定DAST下分析訓練策略的敏感度。</w:t>
+        <w:t xml:space="preserve">因此，本研究固定DAST架構，僅改變輸入前處理，探討三個研究問題。RQ1：工況可解釋多少感測器變異？全域正規化能否消除此變異？RQ2：工況感知正規化能否改善多工況子資料集的RUL預測？工況內採用z-score或min-max是否有差異？RQ3：在工況感知正規化之下，學習率暖身（warmup）與梯度裁切（gradient clipping）是否帶來額外效益？本文的貢獻包括：(1)以視窗層級的工況解釋變異量與感測器–RUL相關係數量化工況對模型輸入的影響，並說明全域正規化在數學上無法移除此影響；(2)建立工況分群與正規化統計量僅由訓練引擎估計、並以引擎層級驗證集選模的前處理流程；(3)在固定DAST下分析訓練策略的敏感度。</w:t>
       </w:r>
     </w:p>
     <w:p>
@@ -305,7 +290,7 @@
           <w:sz w:val="20"/>
           <w:szCs w:val="20"/>
         </w:rPr>
-        <w:t xml:space="preserve">STAGNN以分群模型辨識操作工況，再對每個工況群分別進行max-min正規化，並在多工況資料集上觀察到較佳的預測表現[3]。本研究與其差異在於：(1)採用z-score而非min-max；(2)固定既有的DAST架構，使效能差異可歸因於前處理；(3)明確以訓練引擎估計工況中心與正規化統計量，並以引擎層級驗證集選模；(4)以視窗層級指標量化正規化對模型輸入的作用。</w:t>
+        <w:t xml:space="preserve">STAGNN以分群模型辨識操作工況，再對每個工況群分別進行max-min正規化，並在多工況資料集上觀察到較佳的預測表現[3]。本研究與其差異在於：(1)同時比較工況內z-score與min-max兩種尺度轉換；(2)固定既有的DAST架構，使效能差異可歸因於前處理；(3)明確以訓練引擎估計工況中心與正規化統計量，並以引擎層級驗證集選模；(4)以視窗層級指標量化正規化對模型輸入的作用。</w:t>
       </w:r>
       <w:r>
         <w:rPr>
@@ -698,7 +683,7 @@
           <w:sz w:val="20"/>
           <w:szCs w:val="20"/>
         </w:rPr>
-        <w:t xml:space="preserve">3.3 工況感知z-score正規化</w:t>
+        <w:t xml:space="preserve">3.3 工況感知正規化</w:t>
       </w:r>
     </w:p>
     <w:p>
@@ -857,7 +842,82 @@
           <w:sz w:val="20"/>
           <w:szCs w:val="20"/>
         </w:rPr>
-        <w:t xml:space="preserve">驗證與保留引擎直接套用訓練引擎的μ與σ。作為對照，全域正規化（無論min-max或z-score）對每一感測器皆為與工況無關的仿射轉換：</w:t>
+        <w:t xml:space="preserve">工況感知min-max則以訓練引擎中屬於工況c的最小值與最大值，將式(3)的μ</w:t>
+      </w:r>
+      <w:r>
+        <w:rPr>
+          <w:sz w:val="20"/>
+          <w:szCs w:val="20"/>
+          <w:vertAlign w:val="subscript"/>
+        </w:rPr>
+        <w:t xml:space="preserve">c,j</w:t>
+      </w:r>
+      <w:r>
+        <w:rPr>
+          <w:sz w:val="20"/>
+          <w:szCs w:val="20"/>
+        </w:rPr>
+        <w:t xml:space="preserve">換成min</w:t>
+      </w:r>
+      <w:r>
+        <w:rPr>
+          <w:sz w:val="20"/>
+          <w:szCs w:val="20"/>
+          <w:vertAlign w:val="subscript"/>
+        </w:rPr>
+        <w:t xml:space="preserve">c,j</w:t>
+      </w:r>
+      <w:r>
+        <w:rPr>
+          <w:sz w:val="20"/>
+          <w:szCs w:val="20"/>
+        </w:rPr>
+        <w:t xml:space="preserve">、σ</w:t>
+      </w:r>
+      <w:r>
+        <w:rPr>
+          <w:sz w:val="20"/>
+          <w:szCs w:val="20"/>
+          <w:vertAlign w:val="subscript"/>
+        </w:rPr>
+        <w:t xml:space="preserve">c,j</w:t>
+      </w:r>
+      <w:r>
+        <w:rPr>
+          <w:sz w:val="20"/>
+          <w:szCs w:val="20"/>
+        </w:rPr>
+        <w:t xml:space="preserve">換成max</w:t>
+      </w:r>
+      <w:r>
+        <w:rPr>
+          <w:sz w:val="20"/>
+          <w:szCs w:val="20"/>
+          <w:vertAlign w:val="subscript"/>
+        </w:rPr>
+        <w:t xml:space="preserve">c,j</w:t>
+      </w:r>
+      <w:r>
+        <w:rPr>
+          <w:sz w:val="20"/>
+          <w:szCs w:val="20"/>
+        </w:rPr>
+        <w:t xml:space="preserve"> − min</w:t>
+      </w:r>
+      <w:r>
+        <w:rPr>
+          <w:sz w:val="20"/>
+          <w:szCs w:val="20"/>
+          <w:vertAlign w:val="subscript"/>
+        </w:rPr>
+        <w:t xml:space="preserve">c,j</w:t>
+      </w:r>
+      <w:r>
+        <w:rPr>
+          <w:sz w:val="20"/>
+          <w:szCs w:val="20"/>
+        </w:rPr>
+        <w:t xml:space="preserve">。驗證與保留引擎直接套用訓練引擎估計的統計量。作為對照，全域正規化（無論min-max或z-score）對每一感測器皆為與工況無關的仿射轉換：</w:t>
       </w:r>
     </w:p>
     <w:p>
@@ -1012,7 +1072,7 @@
           <w:sz w:val="20"/>
           <w:szCs w:val="20"/>
         </w:rPr>
-        <w:t xml:space="preserve"> = 40、步長1的滑動視窗切分每台引擎的序列，並以視窗最後一個cycle的RUL作為該視窗的標籤[9]。依DAST原文，另對每一視窗計算各感測器的平均值與線性迴歸斜率[9]；兩者以訓練資料擬合的min-max尺度轉換後附加於視窗之後，使模型輸入維度為(T</w:t>
+        <w:t xml:space="preserve">、步長1的滑動視窗切分每台引擎的序列，並以視窗最後一個cycle的RUL作為該視窗的標籤[9]。依DAST原文，另對每一視窗計算各感測器的平均值與線性迴歸斜率[9]；兩者以訓練資料擬合的min-max尺度轉換後附加於視窗之後，使模型輸入維度為(T</w:t>
       </w:r>
       <w:r>
         <w:rPr>
@@ -1027,7 +1087,22 @@
           <w:sz w:val="20"/>
           <w:szCs w:val="20"/>
         </w:rPr>
-        <w:t xml:space="preserve"> + 2) × 14 = 42 × 14。</w:t>
+        <w:t xml:space="preserve"> + 2) × 14。T</w:t>
+      </w:r>
+      <w:r>
+        <w:rPr>
+          <w:sz w:val="20"/>
+          <w:szCs w:val="20"/>
+          <w:vertAlign w:val="subscript"/>
+        </w:rPr>
+        <w:t xml:space="preserve">w</w:t>
+      </w:r>
+      <w:r>
+        <w:rPr>
+          <w:sz w:val="20"/>
+          <w:szCs w:val="20"/>
+        </w:rPr>
+        <w:t xml:space="preserve">的設定見第4.4節。</w:t>
       </w:r>
     </w:p>
     <w:p>
@@ -2101,7 +2176,7 @@
           <w:sz w:val="20"/>
           <w:szCs w:val="20"/>
         </w:rPr>
-        <w:t xml:space="preserve">保留引擎的評估涵蓋其生命週期內的所有滑動視窗，而非只有最後一個視窗，因此本文的數值不宜與以官方測試集最後一個視窗評估的文獻結果（如[9]）直接比較。</w:t>
+        <w:t xml:space="preserve">保留引擎取自官方訓練檔，皆運轉至失效，其最後一個視窗的真實RUL恆為0，因此本文以兩種方式評估。(1)全視窗：涵蓋保留引擎生命週期內的所有滑動視窗。(2)截斷點：仿照官方測試集的產生方式，以固定亂數種子（2026）為每台保留引擎均勻抽取一個時間點，只評估該點的視窗；FD002與FD004各有39與38個評估點，且同一視窗長度下各正規化方式使用相同的截斷點。本文數值仍不宜與官方測試集上的文獻結果（如[9]）直接比較。</w:t>
       </w:r>
     </w:p>
     <w:p>
@@ -2250,7 +2325,7 @@
           <w:sz w:val="20"/>
           <w:szCs w:val="20"/>
         </w:rPr>
-        <w:t xml:space="preserve">NASA Score的單點評分為s(d) = exp(−d/13) − 1（d &lt; 0）或exp(d/10) − 1（d ≥ 0），其中d = ŷ − y；此評分對高估RUL（延後預警）的懲罰較重[6]。本文先在每台引擎內取平均，再對所有保留引擎取平均：</w:t>
+        <w:t xml:space="preserve">NASA Score的單點評分為s(d) = exp(−d/13) − 1（d &lt; 0）或exp(d/10) − 1（d ≥ 0），其中d = ŷ − y；此評分對高估RUL（延後預警）的懲罰較重[6]。本文以截斷點計算Score，與DAST原文相同，將所有保留引擎的評分加總[9]：</w:t>
       </w:r>
     </w:p>
     <w:p>
@@ -2268,18 +2343,6 @@
         <m:r>
           <m:t xml:space="preserve">Score = </m:t>
         </m:r>
-        <m:f>
-          <m:num>
-            <m:r>
-              <m:t>1</m:t>
-            </m:r>
-          </m:num>
-          <m:den>
-            <m:r>
-              <m:t>U</m:t>
-            </m:r>
-          </m:den>
-        </m:f>
         <m:nary>
           <m:naryPr>
             <m:chr m:val="∑"/>
@@ -2296,62 +2359,25 @@
             </m:r>
           </m:sup>
           <m:e>
-            <m:f>
-              <m:num>
+            <m:r>
+              <m:t>s(</m:t>
+            </m:r>
+            <m:sSub>
+              <m:sSubPr/>
+              <m:e>
                 <m:r>
-                  <m:t>1</m:t>
+                  <m:t>d</m:t>
                 </m:r>
-              </m:num>
-              <m:den>
-                <m:sSub>
-                  <m:sSubPr/>
-                  <m:e>
-                    <m:r>
-                      <m:t>N</m:t>
-                    </m:r>
-                  </m:e>
-                  <m:sub>
-                    <m:r>
-                      <m:t>u</m:t>
-                    </m:r>
-                  </m:sub>
-                </m:sSub>
-              </m:den>
-            </m:f>
-            <m:nary>
-              <m:naryPr>
-                <m:chr m:val="∑"/>
-                <m:limLoc m:val="undOvr"/>
-                <m:supHide m:val="1"/>
-              </m:naryPr>
+              </m:e>
               <m:sub>
                 <m:r>
-                  <m:t>n∈u</m:t>
+                  <m:t>u</m:t>
                 </m:r>
               </m:sub>
-              <m:sup/>
-              <m:e>
-                <m:r>
-                  <m:t>s(</m:t>
-                </m:r>
-                <m:sSub>
-                  <m:sSubPr/>
-                  <m:e>
-                    <m:r>
-                      <m:t>d</m:t>
-                    </m:r>
-                  </m:e>
-                  <m:sub>
-                    <m:r>
-                      <m:t>n</m:t>
-                    </m:r>
-                  </m:sub>
-                </m:sSub>
-                <m:r>
-                  <m:t>)</m:t>
-                </m:r>
-              </m:e>
-            </m:nary>
+            </m:sSub>
+            <m:r>
+              <m:t>)</m:t>
+            </m:r>
           </m:e>
         </m:nary>
       </m:oMath>
@@ -2374,7 +2400,22 @@
           <w:sz w:val="20"/>
           <w:szCs w:val="20"/>
         </w:rPr>
-        <w:t xml:space="preserve">由於聚合方式不同，此Score的數值尺度與文獻中將每台測試引擎最後一個視窗加總的Score不同。</w:t>
+        <w:t xml:space="preserve">其中U為保留引擎數，d</w:t>
+      </w:r>
+      <w:r>
+        <w:rPr>
+          <w:sz w:val="20"/>
+          <w:szCs w:val="20"/>
+          <w:vertAlign w:val="subscript"/>
+        </w:rPr>
+        <w:t xml:space="preserve">u</w:t>
+      </w:r>
+      <w:r>
+        <w:rPr>
+          <w:sz w:val="20"/>
+          <w:szCs w:val="20"/>
+        </w:rPr>
+        <w:t xml:space="preserve">為引擎u在截斷點的預測誤差。全視窗評估只報告RMSE。</w:t>
       </w:r>
     </w:p>
     <w:p>
@@ -2402,7 +2443,7 @@
           <w:sz w:val="20"/>
           <w:szCs w:val="20"/>
         </w:rPr>
-        <w:t xml:space="preserve">實驗設定列於表2。與DAST原文相比，原文在FD002與FD004使用長度60的視窗、dropout為0.2，並重複10次取平均[9]；本研究統一採用長度40的視窗與dropout 0.1，因此結果不作為與原文數值的直接比較。</w:t>
+        <w:t xml:space="preserve">實驗設定列於表2。RQ2沿用DAST原文在FD002與FD004的視窗長度60[9]，關閉梯度裁切與暖身，以5個隨機種子重複；RQ3的梯度裁切與暖身網格則以視窗長度40、3個隨機種子進行。由於兩組實驗的視窗長度不同，表3與表4的數值不宜直接比較。此外，本研究的dropout為0.1（原文為0.2），也不採用原文重複10次取平均的做法[9]，因此結果不作為與原文數值的直接比較。</w:t>
       </w:r>
     </w:p>
     <w:p>
@@ -2621,7 +2662,7 @@
                 <w:sz w:val="16"/>
                 <w:szCs w:val="16"/>
               </w:rPr>
-              <w:t xml:space="preserve">40（附加統計特徵後為42）</w:t>
+              <w:t xml:space="preserve">RQ2：60；RQ3：40（附加統計特徵後各加2）</w:t>
             </w:r>
           </w:p>
         </w:tc>
@@ -2931,7 +2972,7 @@
                 <w:sz w:val="16"/>
                 <w:szCs w:val="16"/>
               </w:rPr>
-              <w:t xml:space="preserve">0.5, 1, 2, 5</w:t>
+              <w:t xml:space="preserve">RQ2：關閉；RQ3：0.5, 1, 2, 5</w:t>
             </w:r>
           </w:p>
         </w:tc>
@@ -2993,7 +3034,7 @@
                 <w:sz w:val="16"/>
                 <w:szCs w:val="16"/>
               </w:rPr>
-              <w:t xml:space="preserve">5, 10, 15</w:t>
+              <w:t xml:space="preserve">RQ2：關閉；RQ3：5, 10, 15</w:t>
             </w:r>
           </w:p>
         </w:tc>
@@ -3055,15 +3096,7 @@
                 <w:sz w:val="16"/>
                 <w:szCs w:val="16"/>
               </w:rPr>
-              <w:t xml:space="preserve">20, 42, 100</w:t>
-            </w:r>
-            <w:r>
-              <w:rPr>
-                <w:sz w:val="16"/>
-                <w:szCs w:val="16"/>
-                <w:highlight w:val="yellow"/>
-              </w:rPr>
-              <w:t xml:space="preserve">【RQ2實驗預計增為5個】</w:t>
+              <w:t xml:space="preserve">RQ2：20, 42, 100, 7, 2026；RQ3：20, 42, 100</w:t>
             </w:r>
           </w:p>
         </w:tc>
@@ -3410,21 +3443,6 @@
     </w:p>
     <w:p>
       <w:pPr>
-        <w:spacing w:after="60" w:line="240"/>
-        <w:ind w:firstLine="400"/>
-        <w:jc w:val="both"/>
-      </w:pPr>
-      <w:r>
-        <w:rPr>
-          <w:sz w:val="20"/>
-          <w:szCs w:val="20"/>
-          <w:highlight w:val="yellow"/>
-        </w:rPr>
-        <w:t xml:space="preserve">【待補實驗：FD002與FD004 × {全域min-max、全域z-score、工況感知z-score} × 5個隨機種子，關閉梯度裁切與暖身，其餘協定同第4節；另以FD001與FD003作為單工況對照，在該兩個資料集上工況感知z-score與全域z-score在數學上等價。】</w:t>
-      </w:r>
-    </w:p>
-    <w:p>
-      <w:pPr>
         <w:spacing w:after="120" w:before="60"/>
         <w:jc w:val="center"/>
       </w:pPr>
@@ -3433,7 +3451,7 @@
           <w:sz w:val="18"/>
           <w:szCs w:val="18"/>
         </w:rPr>
-        <w:t xml:space="preserve">表3. 不同正規化方式在保留引擎上的預測結果（平均 ± 標準差）</w:t>
+        <w:t xml:space="preserve">表3. 不同正規化方式在保留引擎上的預測結果（5個種子，平均 ± 標準差）</w:t>
       </w:r>
     </w:p>
     <w:tbl>
@@ -3450,10 +3468,9 @@
       </w:tblPr>
       <w:tblGrid>
         <w:gridCol w:w="1300"/>
-        <w:gridCol w:w="755"/>
-        <w:gridCol w:w="755"/>
-        <w:gridCol w:w="755"/>
-        <w:gridCol w:w="757"/>
+        <w:gridCol w:w="1000"/>
+        <w:gridCol w:w="1000"/>
+        <w:gridCol w:w="1022"/>
       </w:tblGrid>
       <w:tr>
         <w:tc>
@@ -3491,7 +3508,7 @@
         </w:tc>
         <w:tc>
           <w:tcPr>
-            <w:tcW w:type="dxa" w:w="755"/>
+            <w:tcW w:type="dxa" w:w="1000"/>
             <w:tcBorders>
               <w:top w:val="single" w:color="000000" w:sz="4"/>
               <w:left w:val="single" w:color="000000" w:sz="4"/>
@@ -3518,13 +3535,13 @@
                 <w:sz w:val="16"/>
                 <w:szCs w:val="16"/>
               </w:rPr>
-              <w:t xml:space="preserve">FD002 RMSE</w:t>
-            </w:r>
-          </w:p>
-        </w:tc>
-        <w:tc>
-          <w:tcPr>
-            <w:tcW w:type="dxa" w:w="755"/>
+              <w:t xml:space="preserve">全視窗RMSE</w:t>
+            </w:r>
+          </w:p>
+        </w:tc>
+        <w:tc>
+          <w:tcPr>
+            <w:tcW w:type="dxa" w:w="1000"/>
             <w:tcBorders>
               <w:top w:val="single" w:color="000000" w:sz="4"/>
               <w:left w:val="single" w:color="000000" w:sz="4"/>
@@ -3551,13 +3568,13 @@
                 <w:sz w:val="16"/>
                 <w:szCs w:val="16"/>
               </w:rPr>
-              <w:t xml:space="preserve">FD002 Score</w:t>
-            </w:r>
-          </w:p>
-        </w:tc>
-        <w:tc>
-          <w:tcPr>
-            <w:tcW w:type="dxa" w:w="755"/>
+              <w:t xml:space="preserve">截斷點RMSE</w:t>
+            </w:r>
+          </w:p>
+        </w:tc>
+        <w:tc>
+          <w:tcPr>
+            <w:tcW w:type="dxa" w:w="1022"/>
             <w:tcBorders>
               <w:top w:val="single" w:color="000000" w:sz="4"/>
               <w:left w:val="single" w:color="000000" w:sz="4"/>
@@ -3584,31 +3601,33 @@
                 <w:sz w:val="16"/>
                 <w:szCs w:val="16"/>
               </w:rPr>
-              <w:t xml:space="preserve">FD004 RMSE</w:t>
-            </w:r>
-          </w:p>
-        </w:tc>
-        <w:tc>
-          <w:tcPr>
-            <w:tcW w:type="dxa" w:w="757"/>
-            <w:tcBorders>
-              <w:top w:val="single" w:color="000000" w:sz="4"/>
-              <w:left w:val="single" w:color="000000" w:sz="4"/>
-              <w:bottom w:val="single" w:color="000000" w:sz="4"/>
-              <w:right w:val="single" w:color="000000" w:sz="4"/>
-            </w:tcBorders>
-            <w:shd w:fill="E7E6E6" w:color="auto" w:val="clear"/>
-            <w:tcMar>
-              <w:top w:type="dxa" w:w="30"/>
-              <w:left w:type="dxa" w:w="60"/>
-              <w:bottom w:type="dxa" w:w="30"/>
-              <w:right w:type="dxa" w:w="60"/>
-            </w:tcMar>
-            <w:vAlign w:val="center"/>
-          </w:tcPr>
-          <w:p>
-            <w:pPr>
-              <w:jc w:val="center"/>
+              <w:t xml:space="preserve">截斷點Score</w:t>
+            </w:r>
+          </w:p>
+        </w:tc>
+      </w:tr>
+      <w:tr>
+        <w:tc>
+          <w:tcPr>
+            <w:tcW w:type="dxa" w:w="4322"/>
+            <w:gridSpan w:val="4"/>
+            <w:tcBorders>
+              <w:top w:val="single" w:color="000000" w:sz="4"/>
+              <w:left w:val="single" w:color="000000" w:sz="4"/>
+              <w:bottom w:val="single" w:color="000000" w:sz="4"/>
+              <w:right w:val="single" w:color="000000" w:sz="4"/>
+            </w:tcBorders>
+            <w:tcMar>
+              <w:top w:type="dxa" w:w="30"/>
+              <w:left w:type="dxa" w:w="60"/>
+              <w:bottom w:type="dxa" w:w="30"/>
+              <w:right w:type="dxa" w:w="60"/>
+            </w:tcMar>
+            <w:vAlign w:val="center"/>
+          </w:tcPr>
+          <w:p>
+            <w:pPr>
+              <w:jc w:val="left"/>
             </w:pPr>
             <w:r>
               <w:rPr>
@@ -3617,7 +3636,7 @@
                 <w:sz w:val="16"/>
                 <w:szCs w:val="16"/>
               </w:rPr>
-              <w:t xml:space="preserve">FD004 Score</w:t>
+              <w:t xml:space="preserve">FD002</w:t>
             </w:r>
           </w:p>
         </w:tc>
@@ -3649,131 +3668,97 @@
                 <w:sz w:val="16"/>
                 <w:szCs w:val="16"/>
               </w:rPr>
-              <w:t xml:space="preserve">全域min-max（DAST原文）</w:t>
-            </w:r>
-          </w:p>
-        </w:tc>
-        <w:tc>
-          <w:tcPr>
-            <w:tcW w:type="dxa" w:w="755"/>
-            <w:tcBorders>
-              <w:top w:val="single" w:color="000000" w:sz="4"/>
-              <w:left w:val="single" w:color="000000" w:sz="4"/>
-              <w:bottom w:val="single" w:color="000000" w:sz="4"/>
-              <w:right w:val="single" w:color="000000" w:sz="4"/>
-            </w:tcBorders>
-            <w:tcMar>
-              <w:top w:type="dxa" w:w="30"/>
-              <w:left w:type="dxa" w:w="60"/>
-              <w:bottom w:type="dxa" w:w="30"/>
-              <w:right w:type="dxa" w:w="60"/>
-            </w:tcMar>
-            <w:vAlign w:val="center"/>
-          </w:tcPr>
-          <w:p>
-            <w:pPr>
-              <w:jc w:val="center"/>
-            </w:pPr>
-            <w:r>
-              <w:rPr>
-                <w:sz w:val="16"/>
-                <w:szCs w:val="16"/>
-                <w:highlight w:val="yellow"/>
-              </w:rPr>
-              <w:t xml:space="preserve">【—】</w:t>
-            </w:r>
-          </w:p>
-        </w:tc>
-        <w:tc>
-          <w:tcPr>
-            <w:tcW w:type="dxa" w:w="755"/>
-            <w:tcBorders>
-              <w:top w:val="single" w:color="000000" w:sz="4"/>
-              <w:left w:val="single" w:color="000000" w:sz="4"/>
-              <w:bottom w:val="single" w:color="000000" w:sz="4"/>
-              <w:right w:val="single" w:color="000000" w:sz="4"/>
-            </w:tcBorders>
-            <w:tcMar>
-              <w:top w:type="dxa" w:w="30"/>
-              <w:left w:type="dxa" w:w="60"/>
-              <w:bottom w:type="dxa" w:w="30"/>
-              <w:right w:type="dxa" w:w="60"/>
-            </w:tcMar>
-            <w:vAlign w:val="center"/>
-          </w:tcPr>
-          <w:p>
-            <w:pPr>
-              <w:jc w:val="center"/>
-            </w:pPr>
-            <w:r>
-              <w:rPr>
-                <w:sz w:val="16"/>
-                <w:szCs w:val="16"/>
-                <w:highlight w:val="yellow"/>
-              </w:rPr>
-              <w:t xml:space="preserve">【—】</w:t>
-            </w:r>
-          </w:p>
-        </w:tc>
-        <w:tc>
-          <w:tcPr>
-            <w:tcW w:type="dxa" w:w="755"/>
-            <w:tcBorders>
-              <w:top w:val="single" w:color="000000" w:sz="4"/>
-              <w:left w:val="single" w:color="000000" w:sz="4"/>
-              <w:bottom w:val="single" w:color="000000" w:sz="4"/>
-              <w:right w:val="single" w:color="000000" w:sz="4"/>
-            </w:tcBorders>
-            <w:tcMar>
-              <w:top w:type="dxa" w:w="30"/>
-              <w:left w:type="dxa" w:w="60"/>
-              <w:bottom w:type="dxa" w:w="30"/>
-              <w:right w:type="dxa" w:w="60"/>
-            </w:tcMar>
-            <w:vAlign w:val="center"/>
-          </w:tcPr>
-          <w:p>
-            <w:pPr>
-              <w:jc w:val="center"/>
-            </w:pPr>
-            <w:r>
-              <w:rPr>
-                <w:sz w:val="16"/>
-                <w:szCs w:val="16"/>
-                <w:highlight w:val="yellow"/>
-              </w:rPr>
-              <w:t xml:space="preserve">【—】</w:t>
-            </w:r>
-          </w:p>
-        </w:tc>
-        <w:tc>
-          <w:tcPr>
-            <w:tcW w:type="dxa" w:w="757"/>
-            <w:tcBorders>
-              <w:top w:val="single" w:color="000000" w:sz="4"/>
-              <w:left w:val="single" w:color="000000" w:sz="4"/>
-              <w:bottom w:val="single" w:color="000000" w:sz="4"/>
-              <w:right w:val="single" w:color="000000" w:sz="4"/>
-            </w:tcBorders>
-            <w:tcMar>
-              <w:top w:type="dxa" w:w="30"/>
-              <w:left w:type="dxa" w:w="60"/>
-              <w:bottom w:type="dxa" w:w="30"/>
-              <w:right w:type="dxa" w:w="60"/>
-            </w:tcMar>
-            <w:vAlign w:val="center"/>
-          </w:tcPr>
-          <w:p>
-            <w:pPr>
-              <w:jc w:val="center"/>
-            </w:pPr>
-            <w:r>
-              <w:rPr>
-                <w:sz w:val="16"/>
-                <w:szCs w:val="16"/>
-                <w:highlight w:val="yellow"/>
-              </w:rPr>
-              <w:t xml:space="preserve">【—】</w:t>
+              <w:t xml:space="preserve">全域min-max</w:t>
+            </w:r>
+          </w:p>
+        </w:tc>
+        <w:tc>
+          <w:tcPr>
+            <w:tcW w:type="dxa" w:w="1000"/>
+            <w:tcBorders>
+              <w:top w:val="single" w:color="000000" w:sz="4"/>
+              <w:left w:val="single" w:color="000000" w:sz="4"/>
+              <w:bottom w:val="single" w:color="000000" w:sz="4"/>
+              <w:right w:val="single" w:color="000000" w:sz="4"/>
+            </w:tcBorders>
+            <w:tcMar>
+              <w:top w:type="dxa" w:w="30"/>
+              <w:left w:type="dxa" w:w="60"/>
+              <w:bottom w:type="dxa" w:w="30"/>
+              <w:right w:type="dxa" w:w="60"/>
+            </w:tcMar>
+            <w:vAlign w:val="center"/>
+          </w:tcPr>
+          <w:p>
+            <w:pPr>
+              <w:jc w:val="center"/>
+            </w:pPr>
+            <w:r>
+              <w:rPr>
+                <w:sz w:val="16"/>
+                <w:szCs w:val="16"/>
+              </w:rPr>
+              <w:t xml:space="preserve">15.71 ± 0.52</w:t>
+            </w:r>
+          </w:p>
+        </w:tc>
+        <w:tc>
+          <w:tcPr>
+            <w:tcW w:type="dxa" w:w="1000"/>
+            <w:tcBorders>
+              <w:top w:val="single" w:color="000000" w:sz="4"/>
+              <w:left w:val="single" w:color="000000" w:sz="4"/>
+              <w:bottom w:val="single" w:color="000000" w:sz="4"/>
+              <w:right w:val="single" w:color="000000" w:sz="4"/>
+            </w:tcBorders>
+            <w:tcMar>
+              <w:top w:type="dxa" w:w="30"/>
+              <w:left w:type="dxa" w:w="60"/>
+              <w:bottom w:type="dxa" w:w="30"/>
+              <w:right w:type="dxa" w:w="60"/>
+            </w:tcMar>
+            <w:vAlign w:val="center"/>
+          </w:tcPr>
+          <w:p>
+            <w:pPr>
+              <w:jc w:val="center"/>
+            </w:pPr>
+            <w:r>
+              <w:rPr>
+                <w:sz w:val="16"/>
+                <w:szCs w:val="16"/>
+              </w:rPr>
+              <w:t xml:space="preserve">16.29 ± 1.01</w:t>
+            </w:r>
+          </w:p>
+        </w:tc>
+        <w:tc>
+          <w:tcPr>
+            <w:tcW w:type="dxa" w:w="1022"/>
+            <w:tcBorders>
+              <w:top w:val="single" w:color="000000" w:sz="4"/>
+              <w:left w:val="single" w:color="000000" w:sz="4"/>
+              <w:bottom w:val="single" w:color="000000" w:sz="4"/>
+              <w:right w:val="single" w:color="000000" w:sz="4"/>
+            </w:tcBorders>
+            <w:tcMar>
+              <w:top w:type="dxa" w:w="30"/>
+              <w:left w:type="dxa" w:w="60"/>
+              <w:bottom w:type="dxa" w:w="30"/>
+              <w:right w:type="dxa" w:w="60"/>
+            </w:tcMar>
+            <w:vAlign w:val="center"/>
+          </w:tcPr>
+          <w:p>
+            <w:pPr>
+              <w:jc w:val="center"/>
+            </w:pPr>
+            <w:r>
+              <w:rPr>
+                <w:sz w:val="16"/>
+                <w:szCs w:val="16"/>
+              </w:rPr>
+              <w:t xml:space="preserve">190.0 ± 39.2</w:t>
             </w:r>
           </w:p>
         </w:tc>
@@ -3811,125 +3796,91 @@
         </w:tc>
         <w:tc>
           <w:tcPr>
-            <w:tcW w:type="dxa" w:w="755"/>
-            <w:tcBorders>
-              <w:top w:val="single" w:color="000000" w:sz="4"/>
-              <w:left w:val="single" w:color="000000" w:sz="4"/>
-              <w:bottom w:val="single" w:color="000000" w:sz="4"/>
-              <w:right w:val="single" w:color="000000" w:sz="4"/>
-            </w:tcBorders>
-            <w:tcMar>
-              <w:top w:type="dxa" w:w="30"/>
-              <w:left w:type="dxa" w:w="60"/>
-              <w:bottom w:type="dxa" w:w="30"/>
-              <w:right w:type="dxa" w:w="60"/>
-            </w:tcMar>
-            <w:vAlign w:val="center"/>
-          </w:tcPr>
-          <w:p>
-            <w:pPr>
-              <w:jc w:val="center"/>
-            </w:pPr>
-            <w:r>
-              <w:rPr>
-                <w:sz w:val="16"/>
-                <w:szCs w:val="16"/>
-                <w:highlight w:val="yellow"/>
-              </w:rPr>
-              <w:t xml:space="preserve">【—】</w:t>
-            </w:r>
-          </w:p>
-        </w:tc>
-        <w:tc>
-          <w:tcPr>
-            <w:tcW w:type="dxa" w:w="755"/>
-            <w:tcBorders>
-              <w:top w:val="single" w:color="000000" w:sz="4"/>
-              <w:left w:val="single" w:color="000000" w:sz="4"/>
-              <w:bottom w:val="single" w:color="000000" w:sz="4"/>
-              <w:right w:val="single" w:color="000000" w:sz="4"/>
-            </w:tcBorders>
-            <w:tcMar>
-              <w:top w:type="dxa" w:w="30"/>
-              <w:left w:type="dxa" w:w="60"/>
-              <w:bottom w:type="dxa" w:w="30"/>
-              <w:right w:type="dxa" w:w="60"/>
-            </w:tcMar>
-            <w:vAlign w:val="center"/>
-          </w:tcPr>
-          <w:p>
-            <w:pPr>
-              <w:jc w:val="center"/>
-            </w:pPr>
-            <w:r>
-              <w:rPr>
-                <w:sz w:val="16"/>
-                <w:szCs w:val="16"/>
-                <w:highlight w:val="yellow"/>
-              </w:rPr>
-              <w:t xml:space="preserve">【—】</w:t>
-            </w:r>
-          </w:p>
-        </w:tc>
-        <w:tc>
-          <w:tcPr>
-            <w:tcW w:type="dxa" w:w="755"/>
-            <w:tcBorders>
-              <w:top w:val="single" w:color="000000" w:sz="4"/>
-              <w:left w:val="single" w:color="000000" w:sz="4"/>
-              <w:bottom w:val="single" w:color="000000" w:sz="4"/>
-              <w:right w:val="single" w:color="000000" w:sz="4"/>
-            </w:tcBorders>
-            <w:tcMar>
-              <w:top w:type="dxa" w:w="30"/>
-              <w:left w:type="dxa" w:w="60"/>
-              <w:bottom w:type="dxa" w:w="30"/>
-              <w:right w:type="dxa" w:w="60"/>
-            </w:tcMar>
-            <w:vAlign w:val="center"/>
-          </w:tcPr>
-          <w:p>
-            <w:pPr>
-              <w:jc w:val="center"/>
-            </w:pPr>
-            <w:r>
-              <w:rPr>
-                <w:sz w:val="16"/>
-                <w:szCs w:val="16"/>
-                <w:highlight w:val="yellow"/>
-              </w:rPr>
-              <w:t xml:space="preserve">【—】</w:t>
-            </w:r>
-          </w:p>
-        </w:tc>
-        <w:tc>
-          <w:tcPr>
-            <w:tcW w:type="dxa" w:w="757"/>
-            <w:tcBorders>
-              <w:top w:val="single" w:color="000000" w:sz="4"/>
-              <w:left w:val="single" w:color="000000" w:sz="4"/>
-              <w:bottom w:val="single" w:color="000000" w:sz="4"/>
-              <w:right w:val="single" w:color="000000" w:sz="4"/>
-            </w:tcBorders>
-            <w:tcMar>
-              <w:top w:type="dxa" w:w="30"/>
-              <w:left w:type="dxa" w:w="60"/>
-              <w:bottom w:type="dxa" w:w="30"/>
-              <w:right w:type="dxa" w:w="60"/>
-            </w:tcMar>
-            <w:vAlign w:val="center"/>
-          </w:tcPr>
-          <w:p>
-            <w:pPr>
-              <w:jc w:val="center"/>
-            </w:pPr>
-            <w:r>
-              <w:rPr>
-                <w:sz w:val="16"/>
-                <w:szCs w:val="16"/>
-                <w:highlight w:val="yellow"/>
-              </w:rPr>
-              <w:t xml:space="preserve">【—】</w:t>
+            <w:tcW w:type="dxa" w:w="1000"/>
+            <w:tcBorders>
+              <w:top w:val="single" w:color="000000" w:sz="4"/>
+              <w:left w:val="single" w:color="000000" w:sz="4"/>
+              <w:bottom w:val="single" w:color="000000" w:sz="4"/>
+              <w:right w:val="single" w:color="000000" w:sz="4"/>
+            </w:tcBorders>
+            <w:tcMar>
+              <w:top w:type="dxa" w:w="30"/>
+              <w:left w:type="dxa" w:w="60"/>
+              <w:bottom w:type="dxa" w:w="30"/>
+              <w:right w:type="dxa" w:w="60"/>
+            </w:tcMar>
+            <w:vAlign w:val="center"/>
+          </w:tcPr>
+          <w:p>
+            <w:pPr>
+              <w:jc w:val="center"/>
+            </w:pPr>
+            <w:r>
+              <w:rPr>
+                <w:sz w:val="16"/>
+                <w:szCs w:val="16"/>
+              </w:rPr>
+              <w:t xml:space="preserve">15.83 ± 0.39</w:t>
+            </w:r>
+          </w:p>
+        </w:tc>
+        <w:tc>
+          <w:tcPr>
+            <w:tcW w:type="dxa" w:w="1000"/>
+            <w:tcBorders>
+              <w:top w:val="single" w:color="000000" w:sz="4"/>
+              <w:left w:val="single" w:color="000000" w:sz="4"/>
+              <w:bottom w:val="single" w:color="000000" w:sz="4"/>
+              <w:right w:val="single" w:color="000000" w:sz="4"/>
+            </w:tcBorders>
+            <w:tcMar>
+              <w:top w:type="dxa" w:w="30"/>
+              <w:left w:type="dxa" w:w="60"/>
+              <w:bottom w:type="dxa" w:w="30"/>
+              <w:right w:type="dxa" w:w="60"/>
+            </w:tcMar>
+            <w:vAlign w:val="center"/>
+          </w:tcPr>
+          <w:p>
+            <w:pPr>
+              <w:jc w:val="center"/>
+            </w:pPr>
+            <w:r>
+              <w:rPr>
+                <w:sz w:val="16"/>
+                <w:szCs w:val="16"/>
+              </w:rPr>
+              <w:t xml:space="preserve">17.12 ± 2.51</w:t>
+            </w:r>
+          </w:p>
+        </w:tc>
+        <w:tc>
+          <w:tcPr>
+            <w:tcW w:type="dxa" w:w="1022"/>
+            <w:tcBorders>
+              <w:top w:val="single" w:color="000000" w:sz="4"/>
+              <w:left w:val="single" w:color="000000" w:sz="4"/>
+              <w:bottom w:val="single" w:color="000000" w:sz="4"/>
+              <w:right w:val="single" w:color="000000" w:sz="4"/>
+            </w:tcBorders>
+            <w:tcMar>
+              <w:top w:type="dxa" w:w="30"/>
+              <w:left w:type="dxa" w:w="60"/>
+              <w:bottom w:type="dxa" w:w="30"/>
+              <w:right w:type="dxa" w:w="60"/>
+            </w:tcMar>
+            <w:vAlign w:val="center"/>
+          </w:tcPr>
+          <w:p>
+            <w:pPr>
+              <w:jc w:val="center"/>
+            </w:pPr>
+            <w:r>
+              <w:rPr>
+                <w:sz w:val="16"/>
+                <w:szCs w:val="16"/>
+              </w:rPr>
+              <w:t xml:space="preserve">289.0 ± 147.7</w:t>
             </w:r>
           </w:p>
         </w:tc>
@@ -3961,136 +3912,759 @@
                 <w:sz w:val="16"/>
                 <w:szCs w:val="16"/>
               </w:rPr>
+              <w:t xml:space="preserve">工況感知min-max</w:t>
+            </w:r>
+          </w:p>
+        </w:tc>
+        <w:tc>
+          <w:tcPr>
+            <w:tcW w:type="dxa" w:w="1000"/>
+            <w:tcBorders>
+              <w:top w:val="single" w:color="000000" w:sz="4"/>
+              <w:left w:val="single" w:color="000000" w:sz="4"/>
+              <w:bottom w:val="single" w:color="000000" w:sz="4"/>
+              <w:right w:val="single" w:color="000000" w:sz="4"/>
+            </w:tcBorders>
+            <w:tcMar>
+              <w:top w:type="dxa" w:w="30"/>
+              <w:left w:type="dxa" w:w="60"/>
+              <w:bottom w:type="dxa" w:w="30"/>
+              <w:right w:type="dxa" w:w="60"/>
+            </w:tcMar>
+            <w:vAlign w:val="center"/>
+          </w:tcPr>
+          <w:p>
+            <w:pPr>
+              <w:jc w:val="center"/>
+            </w:pPr>
+            <w:r>
+              <w:rPr>
+                <w:sz w:val="16"/>
+                <w:szCs w:val="16"/>
+              </w:rPr>
+              <w:t xml:space="preserve">12.49 ± 0.43</w:t>
+            </w:r>
+          </w:p>
+        </w:tc>
+        <w:tc>
+          <w:tcPr>
+            <w:tcW w:type="dxa" w:w="1000"/>
+            <w:tcBorders>
+              <w:top w:val="single" w:color="000000" w:sz="4"/>
+              <w:left w:val="single" w:color="000000" w:sz="4"/>
+              <w:bottom w:val="single" w:color="000000" w:sz="4"/>
+              <w:right w:val="single" w:color="000000" w:sz="4"/>
+            </w:tcBorders>
+            <w:tcMar>
+              <w:top w:type="dxa" w:w="30"/>
+              <w:left w:type="dxa" w:w="60"/>
+              <w:bottom w:type="dxa" w:w="30"/>
+              <w:right w:type="dxa" w:w="60"/>
+            </w:tcMar>
+            <w:vAlign w:val="center"/>
+          </w:tcPr>
+          <w:p>
+            <w:pPr>
+              <w:jc w:val="center"/>
+            </w:pPr>
+            <w:r>
+              <w:rPr>
+                <w:sz w:val="16"/>
+                <w:szCs w:val="16"/>
+              </w:rPr>
+              <w:t xml:space="preserve">12.07 ± 0.96</w:t>
+            </w:r>
+          </w:p>
+        </w:tc>
+        <w:tc>
+          <w:tcPr>
+            <w:tcW w:type="dxa" w:w="1022"/>
+            <w:tcBorders>
+              <w:top w:val="single" w:color="000000" w:sz="4"/>
+              <w:left w:val="single" w:color="000000" w:sz="4"/>
+              <w:bottom w:val="single" w:color="000000" w:sz="4"/>
+              <w:right w:val="single" w:color="000000" w:sz="4"/>
+            </w:tcBorders>
+            <w:tcMar>
+              <w:top w:type="dxa" w:w="30"/>
+              <w:left w:type="dxa" w:w="60"/>
+              <w:bottom w:type="dxa" w:w="30"/>
+              <w:right w:type="dxa" w:w="60"/>
+            </w:tcMar>
+            <w:vAlign w:val="center"/>
+          </w:tcPr>
+          <w:p>
+            <w:pPr>
+              <w:jc w:val="center"/>
+            </w:pPr>
+            <w:r>
+              <w:rPr>
+                <w:sz w:val="16"/>
+                <w:szCs w:val="16"/>
+              </w:rPr>
+              <w:t xml:space="preserve">108.6 ± 19.8</w:t>
+            </w:r>
+          </w:p>
+        </w:tc>
+      </w:tr>
+      <w:tr>
+        <w:tc>
+          <w:tcPr>
+            <w:tcW w:type="dxa" w:w="1300"/>
+            <w:tcBorders>
+              <w:top w:val="single" w:color="000000" w:sz="4"/>
+              <w:left w:val="single" w:color="000000" w:sz="4"/>
+              <w:bottom w:val="single" w:color="000000" w:sz="4"/>
+              <w:right w:val="single" w:color="000000" w:sz="4"/>
+            </w:tcBorders>
+            <w:tcMar>
+              <w:top w:type="dxa" w:w="30"/>
+              <w:left w:type="dxa" w:w="60"/>
+              <w:bottom w:type="dxa" w:w="30"/>
+              <w:right w:type="dxa" w:w="60"/>
+            </w:tcMar>
+            <w:vAlign w:val="center"/>
+          </w:tcPr>
+          <w:p>
+            <w:pPr>
+              <w:jc w:val="center"/>
+            </w:pPr>
+            <w:r>
+              <w:rPr>
+                <w:sz w:val="16"/>
+                <w:szCs w:val="16"/>
+              </w:rPr>
               <w:t xml:space="preserve">工況感知z-score</w:t>
             </w:r>
           </w:p>
         </w:tc>
         <w:tc>
           <w:tcPr>
-            <w:tcW w:type="dxa" w:w="755"/>
-            <w:tcBorders>
-              <w:top w:val="single" w:color="000000" w:sz="4"/>
-              <w:left w:val="single" w:color="000000" w:sz="4"/>
-              <w:bottom w:val="single" w:color="000000" w:sz="4"/>
-              <w:right w:val="single" w:color="000000" w:sz="4"/>
-            </w:tcBorders>
-            <w:tcMar>
-              <w:top w:type="dxa" w:w="30"/>
-              <w:left w:type="dxa" w:w="60"/>
-              <w:bottom w:type="dxa" w:w="30"/>
-              <w:right w:type="dxa" w:w="60"/>
-            </w:tcMar>
-            <w:vAlign w:val="center"/>
-          </w:tcPr>
-          <w:p>
-            <w:pPr>
-              <w:jc w:val="center"/>
-            </w:pPr>
-            <w:r>
-              <w:rPr>
-                <w:sz w:val="16"/>
-                <w:szCs w:val="16"/>
-                <w:highlight w:val="yellow"/>
-              </w:rPr>
-              <w:t xml:space="preserve">【—】</w:t>
-            </w:r>
-          </w:p>
-        </w:tc>
-        <w:tc>
-          <w:tcPr>
-            <w:tcW w:type="dxa" w:w="755"/>
-            <w:tcBorders>
-              <w:top w:val="single" w:color="000000" w:sz="4"/>
-              <w:left w:val="single" w:color="000000" w:sz="4"/>
-              <w:bottom w:val="single" w:color="000000" w:sz="4"/>
-              <w:right w:val="single" w:color="000000" w:sz="4"/>
-            </w:tcBorders>
-            <w:tcMar>
-              <w:top w:type="dxa" w:w="30"/>
-              <w:left w:type="dxa" w:w="60"/>
-              <w:bottom w:type="dxa" w:w="30"/>
-              <w:right w:type="dxa" w:w="60"/>
-            </w:tcMar>
-            <w:vAlign w:val="center"/>
-          </w:tcPr>
-          <w:p>
-            <w:pPr>
-              <w:jc w:val="center"/>
-            </w:pPr>
-            <w:r>
-              <w:rPr>
-                <w:sz w:val="16"/>
-                <w:szCs w:val="16"/>
-                <w:highlight w:val="yellow"/>
-              </w:rPr>
-              <w:t xml:space="preserve">【—】</w:t>
-            </w:r>
-          </w:p>
-        </w:tc>
-        <w:tc>
-          <w:tcPr>
-            <w:tcW w:type="dxa" w:w="755"/>
-            <w:tcBorders>
-              <w:top w:val="single" w:color="000000" w:sz="4"/>
-              <w:left w:val="single" w:color="000000" w:sz="4"/>
-              <w:bottom w:val="single" w:color="000000" w:sz="4"/>
-              <w:right w:val="single" w:color="000000" w:sz="4"/>
-            </w:tcBorders>
-            <w:tcMar>
-              <w:top w:type="dxa" w:w="30"/>
-              <w:left w:type="dxa" w:w="60"/>
-              <w:bottom w:type="dxa" w:w="30"/>
-              <w:right w:type="dxa" w:w="60"/>
-            </w:tcMar>
-            <w:vAlign w:val="center"/>
-          </w:tcPr>
-          <w:p>
-            <w:pPr>
-              <w:jc w:val="center"/>
-            </w:pPr>
-            <w:r>
-              <w:rPr>
-                <w:sz w:val="16"/>
-                <w:szCs w:val="16"/>
-                <w:highlight w:val="yellow"/>
-              </w:rPr>
-              <w:t xml:space="preserve">【—】</w:t>
-            </w:r>
-          </w:p>
-        </w:tc>
-        <w:tc>
-          <w:tcPr>
-            <w:tcW w:type="dxa" w:w="757"/>
-            <w:tcBorders>
-              <w:top w:val="single" w:color="000000" w:sz="4"/>
-              <w:left w:val="single" w:color="000000" w:sz="4"/>
-              <w:bottom w:val="single" w:color="000000" w:sz="4"/>
-              <w:right w:val="single" w:color="000000" w:sz="4"/>
-            </w:tcBorders>
-            <w:tcMar>
-              <w:top w:type="dxa" w:w="30"/>
-              <w:left w:type="dxa" w:w="60"/>
-              <w:bottom w:type="dxa" w:w="30"/>
-              <w:right w:type="dxa" w:w="60"/>
-            </w:tcMar>
-            <w:vAlign w:val="center"/>
-          </w:tcPr>
-          <w:p>
-            <w:pPr>
-              <w:jc w:val="center"/>
-            </w:pPr>
-            <w:r>
-              <w:rPr>
-                <w:sz w:val="16"/>
-                <w:szCs w:val="16"/>
-                <w:highlight w:val="yellow"/>
-              </w:rPr>
-              <w:t xml:space="preserve">【—】</w:t>
+            <w:tcW w:type="dxa" w:w="1000"/>
+            <w:tcBorders>
+              <w:top w:val="single" w:color="000000" w:sz="4"/>
+              <w:left w:val="single" w:color="000000" w:sz="4"/>
+              <w:bottom w:val="single" w:color="000000" w:sz="4"/>
+              <w:right w:val="single" w:color="000000" w:sz="4"/>
+            </w:tcBorders>
+            <w:tcMar>
+              <w:top w:type="dxa" w:w="30"/>
+              <w:left w:type="dxa" w:w="60"/>
+              <w:bottom w:type="dxa" w:w="30"/>
+              <w:right w:type="dxa" w:w="60"/>
+            </w:tcMar>
+            <w:vAlign w:val="center"/>
+          </w:tcPr>
+          <w:p>
+            <w:pPr>
+              <w:jc w:val="center"/>
+            </w:pPr>
+            <w:r>
+              <w:rPr>
+                <w:sz w:val="16"/>
+                <w:szCs w:val="16"/>
+              </w:rPr>
+              <w:t xml:space="preserve">12.54 ± 0.58</w:t>
+            </w:r>
+          </w:p>
+        </w:tc>
+        <w:tc>
+          <w:tcPr>
+            <w:tcW w:type="dxa" w:w="1000"/>
+            <w:tcBorders>
+              <w:top w:val="single" w:color="000000" w:sz="4"/>
+              <w:left w:val="single" w:color="000000" w:sz="4"/>
+              <w:bottom w:val="single" w:color="000000" w:sz="4"/>
+              <w:right w:val="single" w:color="000000" w:sz="4"/>
+            </w:tcBorders>
+            <w:tcMar>
+              <w:top w:type="dxa" w:w="30"/>
+              <w:left w:type="dxa" w:w="60"/>
+              <w:bottom w:type="dxa" w:w="30"/>
+              <w:right w:type="dxa" w:w="60"/>
+            </w:tcMar>
+            <w:vAlign w:val="center"/>
+          </w:tcPr>
+          <w:p>
+            <w:pPr>
+              <w:jc w:val="center"/>
+            </w:pPr>
+            <w:r>
+              <w:rPr>
+                <w:sz w:val="16"/>
+                <w:szCs w:val="16"/>
+              </w:rPr>
+              <w:t xml:space="preserve">14.54 ± 1.13</w:t>
+            </w:r>
+          </w:p>
+        </w:tc>
+        <w:tc>
+          <w:tcPr>
+            <w:tcW w:type="dxa" w:w="1022"/>
+            <w:tcBorders>
+              <w:top w:val="single" w:color="000000" w:sz="4"/>
+              <w:left w:val="single" w:color="000000" w:sz="4"/>
+              <w:bottom w:val="single" w:color="000000" w:sz="4"/>
+              <w:right w:val="single" w:color="000000" w:sz="4"/>
+            </w:tcBorders>
+            <w:tcMar>
+              <w:top w:type="dxa" w:w="30"/>
+              <w:left w:type="dxa" w:w="60"/>
+              <w:bottom w:type="dxa" w:w="30"/>
+              <w:right w:type="dxa" w:w="60"/>
+            </w:tcMar>
+            <w:vAlign w:val="center"/>
+          </w:tcPr>
+          <w:p>
+            <w:pPr>
+              <w:jc w:val="center"/>
+            </w:pPr>
+            <w:r>
+              <w:rPr>
+                <w:sz w:val="16"/>
+                <w:szCs w:val="16"/>
+              </w:rPr>
+              <w:t xml:space="preserve">171.9 ± 41.8</w:t>
+            </w:r>
+          </w:p>
+        </w:tc>
+      </w:tr>
+      <w:tr>
+        <w:tc>
+          <w:tcPr>
+            <w:tcW w:type="dxa" w:w="4322"/>
+            <w:gridSpan w:val="4"/>
+            <w:tcBorders>
+              <w:top w:val="single" w:color="000000" w:sz="4"/>
+              <w:left w:val="single" w:color="000000" w:sz="4"/>
+              <w:bottom w:val="single" w:color="000000" w:sz="4"/>
+              <w:right w:val="single" w:color="000000" w:sz="4"/>
+            </w:tcBorders>
+            <w:tcMar>
+              <w:top w:type="dxa" w:w="30"/>
+              <w:left w:type="dxa" w:w="60"/>
+              <w:bottom w:type="dxa" w:w="30"/>
+              <w:right w:type="dxa" w:w="60"/>
+            </w:tcMar>
+            <w:vAlign w:val="center"/>
+          </w:tcPr>
+          <w:p>
+            <w:pPr>
+              <w:jc w:val="left"/>
+            </w:pPr>
+            <w:r>
+              <w:rPr>
+                <w:b/>
+                <w:bCs/>
+                <w:sz w:val="16"/>
+                <w:szCs w:val="16"/>
+              </w:rPr>
+              <w:t xml:space="preserve">FD004</w:t>
+            </w:r>
+          </w:p>
+        </w:tc>
+      </w:tr>
+      <w:tr>
+        <w:tc>
+          <w:tcPr>
+            <w:tcW w:type="dxa" w:w="1300"/>
+            <w:tcBorders>
+              <w:top w:val="single" w:color="000000" w:sz="4"/>
+              <w:left w:val="single" w:color="000000" w:sz="4"/>
+              <w:bottom w:val="single" w:color="000000" w:sz="4"/>
+              <w:right w:val="single" w:color="000000" w:sz="4"/>
+            </w:tcBorders>
+            <w:tcMar>
+              <w:top w:type="dxa" w:w="30"/>
+              <w:left w:type="dxa" w:w="60"/>
+              <w:bottom w:type="dxa" w:w="30"/>
+              <w:right w:type="dxa" w:w="60"/>
+            </w:tcMar>
+            <w:vAlign w:val="center"/>
+          </w:tcPr>
+          <w:p>
+            <w:pPr>
+              <w:jc w:val="center"/>
+            </w:pPr>
+            <w:r>
+              <w:rPr>
+                <w:sz w:val="16"/>
+                <w:szCs w:val="16"/>
+              </w:rPr>
+              <w:t xml:space="preserve">全域min-max</w:t>
+            </w:r>
+          </w:p>
+        </w:tc>
+        <w:tc>
+          <w:tcPr>
+            <w:tcW w:type="dxa" w:w="1000"/>
+            <w:tcBorders>
+              <w:top w:val="single" w:color="000000" w:sz="4"/>
+              <w:left w:val="single" w:color="000000" w:sz="4"/>
+              <w:bottom w:val="single" w:color="000000" w:sz="4"/>
+              <w:right w:val="single" w:color="000000" w:sz="4"/>
+            </w:tcBorders>
+            <w:tcMar>
+              <w:top w:type="dxa" w:w="30"/>
+              <w:left w:type="dxa" w:w="60"/>
+              <w:bottom w:type="dxa" w:w="30"/>
+              <w:right w:type="dxa" w:w="60"/>
+            </w:tcMar>
+            <w:vAlign w:val="center"/>
+          </w:tcPr>
+          <w:p>
+            <w:pPr>
+              <w:jc w:val="center"/>
+            </w:pPr>
+            <w:r>
+              <w:rPr>
+                <w:sz w:val="16"/>
+                <w:szCs w:val="16"/>
+              </w:rPr>
+              <w:t xml:space="preserve">20.20 ± 1.23</w:t>
+            </w:r>
+          </w:p>
+        </w:tc>
+        <w:tc>
+          <w:tcPr>
+            <w:tcW w:type="dxa" w:w="1000"/>
+            <w:tcBorders>
+              <w:top w:val="single" w:color="000000" w:sz="4"/>
+              <w:left w:val="single" w:color="000000" w:sz="4"/>
+              <w:bottom w:val="single" w:color="000000" w:sz="4"/>
+              <w:right w:val="single" w:color="000000" w:sz="4"/>
+            </w:tcBorders>
+            <w:tcMar>
+              <w:top w:type="dxa" w:w="30"/>
+              <w:left w:type="dxa" w:w="60"/>
+              <w:bottom w:type="dxa" w:w="30"/>
+              <w:right w:type="dxa" w:w="60"/>
+            </w:tcMar>
+            <w:vAlign w:val="center"/>
+          </w:tcPr>
+          <w:p>
+            <w:pPr>
+              <w:jc w:val="center"/>
+            </w:pPr>
+            <w:r>
+              <w:rPr>
+                <w:sz w:val="16"/>
+                <w:szCs w:val="16"/>
+              </w:rPr>
+              <w:t xml:space="preserve">21.40 ± 1.71</w:t>
+            </w:r>
+          </w:p>
+        </w:tc>
+        <w:tc>
+          <w:tcPr>
+            <w:tcW w:type="dxa" w:w="1022"/>
+            <w:tcBorders>
+              <w:top w:val="single" w:color="000000" w:sz="4"/>
+              <w:left w:val="single" w:color="000000" w:sz="4"/>
+              <w:bottom w:val="single" w:color="000000" w:sz="4"/>
+              <w:right w:val="single" w:color="000000" w:sz="4"/>
+            </w:tcBorders>
+            <w:tcMar>
+              <w:top w:type="dxa" w:w="30"/>
+              <w:left w:type="dxa" w:w="60"/>
+              <w:bottom w:type="dxa" w:w="30"/>
+              <w:right w:type="dxa" w:w="60"/>
+            </w:tcMar>
+            <w:vAlign w:val="center"/>
+          </w:tcPr>
+          <w:p>
+            <w:pPr>
+              <w:jc w:val="center"/>
+            </w:pPr>
+            <w:r>
+              <w:rPr>
+                <w:sz w:val="16"/>
+                <w:szCs w:val="16"/>
+              </w:rPr>
+              <w:t xml:space="preserve">421.9 ± 101.6</w:t>
+            </w:r>
+          </w:p>
+        </w:tc>
+      </w:tr>
+      <w:tr>
+        <w:tc>
+          <w:tcPr>
+            <w:tcW w:type="dxa" w:w="1300"/>
+            <w:tcBorders>
+              <w:top w:val="single" w:color="000000" w:sz="4"/>
+              <w:left w:val="single" w:color="000000" w:sz="4"/>
+              <w:bottom w:val="single" w:color="000000" w:sz="4"/>
+              <w:right w:val="single" w:color="000000" w:sz="4"/>
+            </w:tcBorders>
+            <w:tcMar>
+              <w:top w:type="dxa" w:w="30"/>
+              <w:left w:type="dxa" w:w="60"/>
+              <w:bottom w:type="dxa" w:w="30"/>
+              <w:right w:type="dxa" w:w="60"/>
+            </w:tcMar>
+            <w:vAlign w:val="center"/>
+          </w:tcPr>
+          <w:p>
+            <w:pPr>
+              <w:jc w:val="center"/>
+            </w:pPr>
+            <w:r>
+              <w:rPr>
+                <w:sz w:val="16"/>
+                <w:szCs w:val="16"/>
+              </w:rPr>
+              <w:t xml:space="preserve">全域z-score</w:t>
+            </w:r>
+          </w:p>
+        </w:tc>
+        <w:tc>
+          <w:tcPr>
+            <w:tcW w:type="dxa" w:w="1000"/>
+            <w:tcBorders>
+              <w:top w:val="single" w:color="000000" w:sz="4"/>
+              <w:left w:val="single" w:color="000000" w:sz="4"/>
+              <w:bottom w:val="single" w:color="000000" w:sz="4"/>
+              <w:right w:val="single" w:color="000000" w:sz="4"/>
+            </w:tcBorders>
+            <w:tcMar>
+              <w:top w:type="dxa" w:w="30"/>
+              <w:left w:type="dxa" w:w="60"/>
+              <w:bottom w:type="dxa" w:w="30"/>
+              <w:right w:type="dxa" w:w="60"/>
+            </w:tcMar>
+            <w:vAlign w:val="center"/>
+          </w:tcPr>
+          <w:p>
+            <w:pPr>
+              <w:jc w:val="center"/>
+            </w:pPr>
+            <w:r>
+              <w:rPr>
+                <w:sz w:val="16"/>
+                <w:szCs w:val="16"/>
+              </w:rPr>
+              <w:t xml:space="preserve">17.86 ± 0.32</w:t>
+            </w:r>
+          </w:p>
+        </w:tc>
+        <w:tc>
+          <w:tcPr>
+            <w:tcW w:type="dxa" w:w="1000"/>
+            <w:tcBorders>
+              <w:top w:val="single" w:color="000000" w:sz="4"/>
+              <w:left w:val="single" w:color="000000" w:sz="4"/>
+              <w:bottom w:val="single" w:color="000000" w:sz="4"/>
+              <w:right w:val="single" w:color="000000" w:sz="4"/>
+            </w:tcBorders>
+            <w:tcMar>
+              <w:top w:type="dxa" w:w="30"/>
+              <w:left w:type="dxa" w:w="60"/>
+              <w:bottom w:type="dxa" w:w="30"/>
+              <w:right w:type="dxa" w:w="60"/>
+            </w:tcMar>
+            <w:vAlign w:val="center"/>
+          </w:tcPr>
+          <w:p>
+            <w:pPr>
+              <w:jc w:val="center"/>
+            </w:pPr>
+            <w:r>
+              <w:rPr>
+                <w:sz w:val="16"/>
+                <w:szCs w:val="16"/>
+              </w:rPr>
+              <w:t xml:space="preserve">18.07 ± 1.01</w:t>
+            </w:r>
+          </w:p>
+        </w:tc>
+        <w:tc>
+          <w:tcPr>
+            <w:tcW w:type="dxa" w:w="1022"/>
+            <w:tcBorders>
+              <w:top w:val="single" w:color="000000" w:sz="4"/>
+              <w:left w:val="single" w:color="000000" w:sz="4"/>
+              <w:bottom w:val="single" w:color="000000" w:sz="4"/>
+              <w:right w:val="single" w:color="000000" w:sz="4"/>
+            </w:tcBorders>
+            <w:tcMar>
+              <w:top w:type="dxa" w:w="30"/>
+              <w:left w:type="dxa" w:w="60"/>
+              <w:bottom w:type="dxa" w:w="30"/>
+              <w:right w:type="dxa" w:w="60"/>
+            </w:tcMar>
+            <w:vAlign w:val="center"/>
+          </w:tcPr>
+          <w:p>
+            <w:pPr>
+              <w:jc w:val="center"/>
+            </w:pPr>
+            <w:r>
+              <w:rPr>
+                <w:sz w:val="16"/>
+                <w:szCs w:val="16"/>
+              </w:rPr>
+              <w:t xml:space="preserve">339.2 ± 63.0</w:t>
+            </w:r>
+          </w:p>
+        </w:tc>
+      </w:tr>
+      <w:tr>
+        <w:tc>
+          <w:tcPr>
+            <w:tcW w:type="dxa" w:w="1300"/>
+            <w:tcBorders>
+              <w:top w:val="single" w:color="000000" w:sz="4"/>
+              <w:left w:val="single" w:color="000000" w:sz="4"/>
+              <w:bottom w:val="single" w:color="000000" w:sz="4"/>
+              <w:right w:val="single" w:color="000000" w:sz="4"/>
+            </w:tcBorders>
+            <w:tcMar>
+              <w:top w:type="dxa" w:w="30"/>
+              <w:left w:type="dxa" w:w="60"/>
+              <w:bottom w:type="dxa" w:w="30"/>
+              <w:right w:type="dxa" w:w="60"/>
+            </w:tcMar>
+            <w:vAlign w:val="center"/>
+          </w:tcPr>
+          <w:p>
+            <w:pPr>
+              <w:jc w:val="center"/>
+            </w:pPr>
+            <w:r>
+              <w:rPr>
+                <w:sz w:val="16"/>
+                <w:szCs w:val="16"/>
+              </w:rPr>
+              <w:t xml:space="preserve">工況感知min-max</w:t>
+            </w:r>
+          </w:p>
+        </w:tc>
+        <w:tc>
+          <w:tcPr>
+            <w:tcW w:type="dxa" w:w="1000"/>
+            <w:tcBorders>
+              <w:top w:val="single" w:color="000000" w:sz="4"/>
+              <w:left w:val="single" w:color="000000" w:sz="4"/>
+              <w:bottom w:val="single" w:color="000000" w:sz="4"/>
+              <w:right w:val="single" w:color="000000" w:sz="4"/>
+            </w:tcBorders>
+            <w:tcMar>
+              <w:top w:type="dxa" w:w="30"/>
+              <w:left w:type="dxa" w:w="60"/>
+              <w:bottom w:type="dxa" w:w="30"/>
+              <w:right w:type="dxa" w:w="60"/>
+            </w:tcMar>
+            <w:vAlign w:val="center"/>
+          </w:tcPr>
+          <w:p>
+            <w:pPr>
+              <w:jc w:val="center"/>
+            </w:pPr>
+            <w:r>
+              <w:rPr>
+                <w:sz w:val="16"/>
+                <w:szCs w:val="16"/>
+              </w:rPr>
+              <w:t xml:space="preserve">15.32 ± 0.31</w:t>
+            </w:r>
+          </w:p>
+        </w:tc>
+        <w:tc>
+          <w:tcPr>
+            <w:tcW w:type="dxa" w:w="1000"/>
+            <w:tcBorders>
+              <w:top w:val="single" w:color="000000" w:sz="4"/>
+              <w:left w:val="single" w:color="000000" w:sz="4"/>
+              <w:bottom w:val="single" w:color="000000" w:sz="4"/>
+              <w:right w:val="single" w:color="000000" w:sz="4"/>
+            </w:tcBorders>
+            <w:tcMar>
+              <w:top w:type="dxa" w:w="30"/>
+              <w:left w:type="dxa" w:w="60"/>
+              <w:bottom w:type="dxa" w:w="30"/>
+              <w:right w:type="dxa" w:w="60"/>
+            </w:tcMar>
+            <w:vAlign w:val="center"/>
+          </w:tcPr>
+          <w:p>
+            <w:pPr>
+              <w:jc w:val="center"/>
+            </w:pPr>
+            <w:r>
+              <w:rPr>
+                <w:sz w:val="16"/>
+                <w:szCs w:val="16"/>
+              </w:rPr>
+              <w:t xml:space="preserve">14.65 ± 0.47</w:t>
+            </w:r>
+          </w:p>
+        </w:tc>
+        <w:tc>
+          <w:tcPr>
+            <w:tcW w:type="dxa" w:w="1022"/>
+            <w:tcBorders>
+              <w:top w:val="single" w:color="000000" w:sz="4"/>
+              <w:left w:val="single" w:color="000000" w:sz="4"/>
+              <w:bottom w:val="single" w:color="000000" w:sz="4"/>
+              <w:right w:val="single" w:color="000000" w:sz="4"/>
+            </w:tcBorders>
+            <w:tcMar>
+              <w:top w:type="dxa" w:w="30"/>
+              <w:left w:type="dxa" w:w="60"/>
+              <w:bottom w:type="dxa" w:w="30"/>
+              <w:right w:type="dxa" w:w="60"/>
+            </w:tcMar>
+            <w:vAlign w:val="center"/>
+          </w:tcPr>
+          <w:p>
+            <w:pPr>
+              <w:jc w:val="center"/>
+            </w:pPr>
+            <w:r>
+              <w:rPr>
+                <w:sz w:val="16"/>
+                <w:szCs w:val="16"/>
+              </w:rPr>
+              <w:t xml:space="preserve">193.5 ± 32.8</w:t>
+            </w:r>
+          </w:p>
+        </w:tc>
+      </w:tr>
+      <w:tr>
+        <w:tc>
+          <w:tcPr>
+            <w:tcW w:type="dxa" w:w="1300"/>
+            <w:tcBorders>
+              <w:top w:val="single" w:color="000000" w:sz="4"/>
+              <w:left w:val="single" w:color="000000" w:sz="4"/>
+              <w:bottom w:val="single" w:color="000000" w:sz="4"/>
+              <w:right w:val="single" w:color="000000" w:sz="4"/>
+            </w:tcBorders>
+            <w:tcMar>
+              <w:top w:type="dxa" w:w="30"/>
+              <w:left w:type="dxa" w:w="60"/>
+              <w:bottom w:type="dxa" w:w="30"/>
+              <w:right w:type="dxa" w:w="60"/>
+            </w:tcMar>
+            <w:vAlign w:val="center"/>
+          </w:tcPr>
+          <w:p>
+            <w:pPr>
+              <w:jc w:val="center"/>
+            </w:pPr>
+            <w:r>
+              <w:rPr>
+                <w:sz w:val="16"/>
+                <w:szCs w:val="16"/>
+              </w:rPr>
+              <w:t xml:space="preserve">工況感知z-score</w:t>
+            </w:r>
+          </w:p>
+        </w:tc>
+        <w:tc>
+          <w:tcPr>
+            <w:tcW w:type="dxa" w:w="1000"/>
+            <w:tcBorders>
+              <w:top w:val="single" w:color="000000" w:sz="4"/>
+              <w:left w:val="single" w:color="000000" w:sz="4"/>
+              <w:bottom w:val="single" w:color="000000" w:sz="4"/>
+              <w:right w:val="single" w:color="000000" w:sz="4"/>
+            </w:tcBorders>
+            <w:tcMar>
+              <w:top w:type="dxa" w:w="30"/>
+              <w:left w:type="dxa" w:w="60"/>
+              <w:bottom w:type="dxa" w:w="30"/>
+              <w:right w:type="dxa" w:w="60"/>
+            </w:tcMar>
+            <w:vAlign w:val="center"/>
+          </w:tcPr>
+          <w:p>
+            <w:pPr>
+              <w:jc w:val="center"/>
+            </w:pPr>
+            <w:r>
+              <w:rPr>
+                <w:sz w:val="16"/>
+                <w:szCs w:val="16"/>
+              </w:rPr>
+              <w:t xml:space="preserve">15.50 ± 0.72</w:t>
+            </w:r>
+          </w:p>
+        </w:tc>
+        <w:tc>
+          <w:tcPr>
+            <w:tcW w:type="dxa" w:w="1000"/>
+            <w:tcBorders>
+              <w:top w:val="single" w:color="000000" w:sz="4"/>
+              <w:left w:val="single" w:color="000000" w:sz="4"/>
+              <w:bottom w:val="single" w:color="000000" w:sz="4"/>
+              <w:right w:val="single" w:color="000000" w:sz="4"/>
+            </w:tcBorders>
+            <w:tcMar>
+              <w:top w:type="dxa" w:w="30"/>
+              <w:left w:type="dxa" w:w="60"/>
+              <w:bottom w:type="dxa" w:w="30"/>
+              <w:right w:type="dxa" w:w="60"/>
+            </w:tcMar>
+            <w:vAlign w:val="center"/>
+          </w:tcPr>
+          <w:p>
+            <w:pPr>
+              <w:jc w:val="center"/>
+            </w:pPr>
+            <w:r>
+              <w:rPr>
+                <w:sz w:val="16"/>
+                <w:szCs w:val="16"/>
+              </w:rPr>
+              <w:t xml:space="preserve">15.73 ± 1.08</w:t>
+            </w:r>
+          </w:p>
+        </w:tc>
+        <w:tc>
+          <w:tcPr>
+            <w:tcW w:type="dxa" w:w="1022"/>
+            <w:tcBorders>
+              <w:top w:val="single" w:color="000000" w:sz="4"/>
+              <w:left w:val="single" w:color="000000" w:sz="4"/>
+              <w:bottom w:val="single" w:color="000000" w:sz="4"/>
+              <w:right w:val="single" w:color="000000" w:sz="4"/>
+            </w:tcBorders>
+            <w:tcMar>
+              <w:top w:type="dxa" w:w="30"/>
+              <w:left w:type="dxa" w:w="60"/>
+              <w:bottom w:type="dxa" w:w="30"/>
+              <w:right w:type="dxa" w:w="60"/>
+            </w:tcMar>
+            <w:vAlign w:val="center"/>
+          </w:tcPr>
+          <w:p>
+            <w:pPr>
+              <w:jc w:val="center"/>
+            </w:pPr>
+            <w:r>
+              <w:rPr>
+                <w:sz w:val="16"/>
+                <w:szCs w:val="16"/>
+              </w:rPr>
+              <w:t xml:space="preserve">204.4 ± 73.9</w:t>
             </w:r>
           </w:p>
         </w:tc>
       </w:tr>
     </w:tbl>
+    <w:p>
+      <w:pPr>
+        <w:spacing w:after="120" w:before="40"/>
+      </w:pPr>
+      <w:r>
+        <w:rPr>
+          <w:sz w:val="16"/>
+          <w:szCs w:val="16"/>
+        </w:rPr>
+        <w:t xml:space="preserve">註：全域min-max為DAST原文的做法。視窗長度60，梯度裁切與暖身皆關閉。</w:t>
+      </w:r>
+    </w:p>
     <w:p>
       <w:pPr>
         <w:spacing w:after="60" w:line="240"/>
@@ -4101,9 +4675,36 @@
         <w:rPr>
           <w:sz w:val="20"/>
           <w:szCs w:val="20"/>
-          <w:highlight w:val="yellow"/>
-        </w:rPr>
-        <w:t xml:space="preserve">【結果敘述待補：報告平均值與標準差，以及工況感知z-score相對於全域z-score的配對差值；5個種子不足以進行顯著性檢定，只描述平均差異。】</w:t>
+        </w:rPr>
+        <w:t xml:space="preserve">表3比較四種正規化方式。各設定皆以驗證RMSE選模，再於保留引擎上評估。兩種工況感知正規化在兩個資料集上的平均誤差皆低於兩種全域正規化：以全視窗RMSE而言，FD002的工況感知方式約為12.5，全域方式為15.71至15.83；FD004的工況感知方式為15.32至15.50，全域方式為17.86至20.20。截斷點RMSE與Score呈現相同的排序。</w:t>
+      </w:r>
+    </w:p>
+    <w:p>
+      <w:pPr>
+        <w:spacing w:after="60" w:line="240"/>
+        <w:ind w:firstLine="400"/>
+        <w:jc w:val="both"/>
+      </w:pPr>
+      <w:r>
+        <w:rPr>
+          <w:sz w:val="20"/>
+          <w:szCs w:val="20"/>
+        </w:rPr>
+        <w:t xml:space="preserve">最直接的比較是工況感知min-max與全域min-max，兩者只差在是否依工況分別估計正規化統計量。以同一隨機種子配對，截斷點RMSE的平均差值在FD002為−4.22（95%信賴區間[−6.24, −2.21]），在FD004為−6.76（[−9.26, −4.25]）；Score的差值分別為−81.4（[−146.1, −16.6]）與−228.5（[−386.2, −70.7]），信賴區間皆不含零。工況感知z-score的改善在FD004同樣明確，相對全域min-max的截斷點RMSE差值為−5.67（[−8.51, −2.84]）；在FD002，其全視窗RMSE較全域z-score低3.30（[−4.34, −2.25]），但截斷點RMSE的信賴區間跨過零（−2.59，[−5.84, +0.67]）。</w:t>
+      </w:r>
+    </w:p>
+    <w:p>
+      <w:pPr>
+        <w:spacing w:after="60" w:line="240"/>
+        <w:ind w:firstLine="400"/>
+        <w:jc w:val="both"/>
+      </w:pPr>
+      <w:r>
+        <w:rPr>
+          <w:sz w:val="20"/>
+          <w:szCs w:val="20"/>
+        </w:rPr>
+        <w:t xml:space="preserve">工況內採用何種尺度轉換的影響則隨評估方式而不同。以全視窗RMSE而言，工況感知z-score與min-max幾乎相同（FD002相差0.05，FD004相差0.18）；以截斷點評估時min-max較佳，z-score減min-max的RMSE差值在FD002為+2.47（[+0.76, +4.17]），在FD004為+1.08（[+0.02, +2.15]）。截斷點評估每個種子只有38至39個評估點，變異較大，因此本文將此差異視為初步觀察。全域min-max與全域z-score之間也沒有一致的優劣：FD004的全域z-score較佳（截斷點RMSE差值−3.33，[−5.45, −1.21]），FD002則無明確差異。整體而言，影響預測誤差的主要因素是是否依工況分別正規化，而非全域正規化的形式，這與第3.3節的推論一致：全域min-max與全域z-score皆為仿射轉換，都無法移除工況造成的群間差異。上述信賴區間僅基於5個種子，作為效果大小的描述，而非顯著性檢定。</w:t>
       </w:r>
     </w:p>
     <w:p>
@@ -4130,7 +4731,7 @@
           <w:sz w:val="18"/>
           <w:szCs w:val="18"/>
         </w:rPr>
-        <w:t xml:space="preserve">表4. 工況感知z-score下不同梯度裁切門檻c與暖身長度w的保留集RMSE（3個種子，平均 ± 標準差）</w:t>
+        <w:t xml:space="preserve">表4. 工況感知z-score下不同梯度裁切門檻c與暖身長度w的保留集全視窗RMSE（視窗長度40，3個種子，平均 ± 標準差）</w:t>
       </w:r>
     </w:p>
     <w:tbl>
@@ -5369,7 +5970,7 @@
           <w:sz w:val="20"/>
           <w:szCs w:val="20"/>
         </w:rPr>
-        <w:t xml:space="preserve">若依驗證RMSE選擇設定，兩個資料集都會選出c = 5、w = 5，其保留集RMSE分別為13.83 ± 0.70（FD002）與14.98 ± 0.24（FD004），NASA Score分別為4.74 ± 2.05與16.43 ± 2.16。整體而言，在工況感知正規化之下，DAST對梯度裁切門檻與暖身長度的選擇相對不敏感，本實驗未觀察到一致的額外效益。需要注意的是，此網格中梯度裁切與暖身皆為開啟狀態，缺少兩者皆關閉的對照，也未記錄梯度範數等訓練過程指標，因此本文不據此推論兩者對訓練穩定性的影響。</w:t>
+        <w:t xml:space="preserve">若依驗證RMSE選擇設定，兩個資料集都會選出c = 5、w = 5，其保留集全視窗RMSE分別為13.83 ± 0.70（FD002）與14.98 ± 0.24（FD004）；截斷點RMSE為13.75 ± 1.01與15.18 ± 0.33，Score為166.7 ± 69.9與168.1 ± 10.5。整體而言，在工況感知正規化之下，DAST對梯度裁切門檻與暖身長度的選擇相對不敏感，本實驗未觀察到一致的額外效益。需要注意的是，此網格中梯度裁切與暖身皆為開啟狀態，且視窗長度為40；表3雖有兩者皆關閉的結果，但視窗長度為60，兩個條件同時改變，因此無法由兩表的差異推論梯度裁切或暖身的效果。此外，本研究未記錄梯度範數等訓練過程指標，因此不據此推論兩者對訓練穩定性的影響。</w:t>
       </w:r>
       <w:r>
         <w:rPr>
@@ -5405,7 +6006,7 @@
           <w:sz w:val="20"/>
           <w:szCs w:val="20"/>
         </w:rPr>
-        <w:t xml:space="preserve">本研究有以下限制。第一，C-MAPSS為模擬資料，結果能否推廣至實際設備仍待驗證。第二，本研究只使用DAST一種架構。第三，保留集僅有39台（FD002）與38台（FD004）引擎，每個設定只有3個隨機種子，因此只報告描述性統計，未進行顯著性檢定。第四，本文未使用官方測試集，也不與文獻數值直接比較。第五，本研究早期曾以官方測試集選擇epoch進行探索性實驗，該批結果未納入本文的主要結果。</w:t>
+        <w:t xml:space="preserve">本研究有以下限制。第一，C-MAPSS為模擬資料，結果能否推廣至實際設備仍待驗證。第二，本研究只使用DAST一種架構。第三，保留集僅有39台（FD002）與38台（FD004）引擎，RQ2與RQ3分別只有5個與3個隨機種子，截斷點評估每個種子也只有38至39個評估點，因此只報告描述性統計與信賴區間，未進行顯著性檢定。第四，本文未使用官方測試集，也不與文獻數值直接比較。第五，本研究早期曾以官方測試集選擇epoch進行探索性實驗，該批結果未納入本文的主要結果。第六，RQ2與RQ3使用不同的視窗長度（60與40）。</w:t>
       </w:r>
     </w:p>
     <w:p>
@@ -5434,22 +6035,7 @@
           <w:sz w:val="20"/>
           <w:szCs w:val="20"/>
         </w:rPr>
-        <w:t xml:space="preserve">本研究在固定DAST架構的前提下，探討多操作工況對RUL預測輸入的影響。針對RQ1，在FD002與FD004中，工況切換幾乎完全主導視窗內的感測器變異，而全域正規化因屬仿射轉換無法移除此影響；工況感知z-score正規化後，工況解釋的變異大幅降低，感測器與RUL的相關性明顯提高。</w:t>
-      </w:r>
-      <w:r>
-        <w:rPr>
-          <w:sz w:val="20"/>
-          <w:szCs w:val="20"/>
-          <w:highlight w:val="yellow"/>
-        </w:rPr>
-        <w:t xml:space="preserve">【RQ2結論待補實驗後撰寫。】</w:t>
-      </w:r>
-      <w:r>
-        <w:rPr>
-          <w:sz w:val="20"/>
-          <w:szCs w:val="20"/>
-        </w:rPr>
-        <w:t xml:space="preserve">針對RQ3，在工況感知正規化之下，梯度裁切門檻與暖身長度的選擇對保留集RMSE的影響與種子間變異相當，未呈現一致的額外效益。未來將以官方測試集、更多隨機種子、依工況分群的min-max正規化對照與更多模型架構進一步驗證。</w:t>
+        <w:t xml:space="preserve">本研究在固定DAST架構的前提下，探討多操作工況對RUL預測輸入的影響。針對RQ1，在FD002與FD004中，工況切換幾乎完全主導視窗內的感測器變異，而全域正規化因屬仿射轉換無法移除此影響；工況感知正規化後，工況解釋的變異大幅降低，感測器與RUL的相關性明顯提高。針對RQ2，兩種工況感知正規化在FD002與FD004保留引擎上的誤差皆低於DAST原文採用的全域min-max與全域z-score；其中工況感知min-max相對全域min-max的改善，在兩個資料集與兩項指標上皆穩定。工況內採用z-score或min-max的差異則依評估方式而異。針對RQ3，在工況感知正規化之下，梯度裁切門檻與暖身長度的選擇對保留集RMSE的影響與種子間變異相當，未呈現一致的額外效益。未來將以官方測試集、更多隨機種子、與RQ2相同視窗長度下的梯度裁切與暖身對照，以及更多模型架構進一步驗證。</w:t>
       </w:r>
     </w:p>
     <w:p>
@@ -5729,22 +6315,7 @@
           <w:sz w:val="20"/>
           <w:szCs w:val="20"/>
         </w:rPr>
-        <w:t xml:space="preserve">Sensor measurements of aero-engines operating under multiple conditions reflect both degradation and operating context, which makes data-driven remaining useful life (RUL) prediction difficult. Using the NASA C-MAPSS dataset and the Dual-Aspect Self-Attention Transformer (DAST), this study examines operating-condition-aware normalization while keeping the model architecture unchanged. Operating conditions are identified by K-means clustering of the operating settings of training engines, and sensor-wise z-score normalization is applied within each condition. All statistics are estimated from training engines only, and models are selected on engine-disjoint validation engines. In FD002 and FD004, operating-condition switching explains about 99.9% of the sensor variance within a 40-cycle window, a proportion that global normalization cannot change; after condition-aware normalization it drops to 0.21–0.22, and the mean absolute correlation between sensors and RUL rises from about 0.11 to above 0.40. </w:t>
-      </w:r>
-      <w:r>
-        <w:rPr>
-          <w:sz w:val="20"/>
-          <w:szCs w:val="20"/>
-          <w:highlight w:val="yellow"/>
-        </w:rPr>
-        <w:t xml:space="preserve">【RQ2 results to be added.】</w:t>
-      </w:r>
-      <w:r>
-        <w:rPr>
-          <w:sz w:val="20"/>
-          <w:szCs w:val="20"/>
-        </w:rPr>
-        <w:t xml:space="preserve"> Under condition-aware normalization, differences in holdout RMSE across 12 gradient-clipping and learning-rate-warmup settings are about one to two times the seed-to-seed standard deviation, showing no consistent additional benefit.</w:t>
+        <w:t xml:space="preserve">Sensor measurements of aero-engines operating under multiple conditions reflect both degradation and operating context, which makes data-driven remaining useful life (RUL) prediction difficult. Using the NASA C-MAPSS dataset and the Dual-Aspect Self-Attention Transformer (DAST), this study examines operating-condition-aware normalization while keeping the model architecture unchanged. Operating conditions are identified by K-means clustering of the operating settings of training engines, and sensors are normalized within each condition by z-score or min-max scaling. All statistics are estimated from training engines only, and models are selected on engine-disjoint validation engines. In FD002 and FD004, operating-condition switching explains about 99.9% of the sensor variance within a 40-cycle window, a proportion that global normalization cannot change; after condition-aware normalization it drops to 0.21–0.22, and the mean absolute correlation between sensors and RUL rises from about 0.11 to above 0.40. Evaluated at one random cut point per holdout engine, condition-aware min-max scaling lowers RMSE by 4.2 and 6.8 cycles on FD002 and FD004 relative to the global min-max scaling used by DAST, with 95% confidence intervals of the seed-paired differences excluding zero. Under condition-aware normalization, differences in holdout RMSE across 12 gradient-clipping and learning-rate-warmup settings are about one to two times the seed-to-seed standard deviation, showing no consistent additional benefit.</w:t>
       </w:r>
     </w:p>
     <w:p>

</xml_diff>